<commit_message>
Release 1.39.0 — Search Tender View details, Evaluation Sheet portal conditions + 3AN-B estimate rule, Tender Notice/Technical Sanction/Monitoring Format updates
Co-Authored-By: Claude Sonnet 5.5 <noreply@anthropic.com>
</commit_message>
<xml_diff>
--- a/resources/work-order-template.docx
+++ b/resources/work-order-template.docx
@@ -29,7 +29,7 @@
       </w:tblGrid>
       <w:tr>
         <w:trPr>
-          <w:trHeight w:val="1600" w:hRule="atLeast"/>
+          <w:trHeight w:val="1450" w:hRule="atLeast"/>
         </w:trPr>
         <w:tc>
           <w:tcPr>
@@ -1985,120 +1985,6 @@
     <w:p>
       <w:pPr>
         <w:spacing w:after="0" w:line="240" w:lineRule="auto"/>
-        <w:rPr>
-          <w:rFonts w:ascii="Times New Roman" w:eastAsia="Times New Roman" w:hAnsi="Times New Roman" w:cs="Times New Roman"/>
-          <w:b/>
-          <w:kern w:val="0"/>
-          <w:sz w:val="22"/>
-          <w:szCs w:val="22"/>
-          <w:lang w:val="en-US"/>
-          <w14:ligatures w14:val="none"/>
-        </w:rPr>
-      </w:pPr>
-      <w:r>
-        <w:rPr>
-          <w:rFonts w:ascii="Times New Roman" w:eastAsia="Times New Roman" w:hAnsi="Times New Roman" w:cs="Times New Roman"/>
-          <w:kern w:val="0"/>
-          <w:sz w:val="22"/>
-          <w:szCs w:val="22"/>
-          <w:lang w:val="en-US"/>
-          <w14:ligatures w14:val="none"/>
-        </w:rPr>
-        <w:tab/>
-      </w:r>
-      <w:r>
-        <w:rPr>
-          <w:rFonts w:ascii="Times New Roman" w:eastAsia="Times New Roman" w:hAnsi="Times New Roman" w:cs="Times New Roman"/>
-          <w:kern w:val="0"/>
-          <w:sz w:val="22"/>
-          <w:szCs w:val="22"/>
-          <w:lang w:val="en-US"/>
-          <w14:ligatures w14:val="none"/>
-        </w:rPr>
-        <w:tab/>
-      </w:r>
-      <w:r>
-        <w:rPr>
-          <w:rFonts w:ascii="Times New Roman" w:eastAsia="Times New Roman" w:hAnsi="Times New Roman" w:cs="Times New Roman"/>
-          <w:kern w:val="0"/>
-          <w:sz w:val="22"/>
-          <w:szCs w:val="22"/>
-          <w:lang w:val="en-US"/>
-          <w14:ligatures w14:val="none"/>
-        </w:rPr>
-        <w:tab/>
-      </w:r>
-      <w:r>
-        <w:rPr>
-          <w:rFonts w:ascii="Times New Roman" w:eastAsia="Times New Roman" w:hAnsi="Times New Roman" w:cs="Times New Roman"/>
-          <w:kern w:val="0"/>
-          <w:sz w:val="22"/>
-          <w:szCs w:val="22"/>
-          <w:lang w:val="en-US"/>
-          <w14:ligatures w14:val="none"/>
-        </w:rPr>
-        <w:tab/>
-      </w:r>
-      <w:r>
-        <w:rPr>
-          <w:rFonts w:ascii="Times New Roman" w:eastAsia="Times New Roman" w:hAnsi="Times New Roman" w:cs="Times New Roman"/>
-          <w:kern w:val="0"/>
-          <w:sz w:val="22"/>
-          <w:szCs w:val="22"/>
-          <w:lang w:val="en-US"/>
-          <w14:ligatures w14:val="none"/>
-        </w:rPr>
-        <w:tab/>
-      </w:r>
-      <w:r>
-        <w:rPr>
-          <w:rFonts w:ascii="Times New Roman" w:eastAsia="Times New Roman" w:hAnsi="Times New Roman" w:cs="Times New Roman"/>
-          <w:kern w:val="0"/>
-          <w:sz w:val="22"/>
-          <w:szCs w:val="22"/>
-          <w:lang w:val="en-US"/>
-          <w14:ligatures w14:val="none"/>
-        </w:rPr>
-        <w:tab/>
-      </w:r>
-      <w:r>
-        <w:rPr>
-          <w:rFonts w:ascii="Times New Roman" w:eastAsia="Times New Roman" w:hAnsi="Times New Roman" w:cs="Times New Roman"/>
-          <w:kern w:val="0"/>
-          <w:sz w:val="22"/>
-          <w:szCs w:val="22"/>
-          <w:lang w:val="en-US"/>
-          <w14:ligatures w14:val="none"/>
-        </w:rPr>
-        <w:tab/>
-      </w:r>
-      <w:r>
-        <w:rPr>
-          <w:rFonts w:ascii="Times New Roman" w:eastAsia="Times New Roman" w:hAnsi="Times New Roman" w:cs="Times New Roman"/>
-          <w:kern w:val="0"/>
-          <w:sz w:val="22"/>
-          <w:szCs w:val="22"/>
-          <w:lang w:val="en-US"/>
-          <w14:ligatures w14:val="none"/>
-        </w:rPr>
-        <w:tab/>
-      </w:r>
-      <w:r>
-        <w:rPr>
-          <w:rFonts w:ascii="Times New Roman" w:eastAsia="Times New Roman" w:hAnsi="Times New Roman" w:cs="Times New Roman"/>
-          <w:b/>
-          <w:kern w:val="0"/>
-          <w:sz w:val="22"/>
-          <w:szCs w:val="22"/>
-          <w:lang w:val="en-US"/>
-          <w14:ligatures w14:val="none"/>
-        </w:rPr>
-        <w:t xml:space="preserve">              </w:t>
-      </w:r>
-    </w:p>
-    <w:p>
-      <w:pPr>
-        <w:spacing w:after="0" w:line="240" w:lineRule="auto"/>
         <w:ind w:left="5040"/>
         <w:jc w:val="center"/>
         <w:rPr>
@@ -2343,7 +2229,7 @@
     </w:p>
     <w:sectPr>
       <w:pgSz w:w="11906" w:h="16838"/>
-      <w:pgMar w:top="480" w:right="1440" w:bottom="720" w:left="1440" w:header="708" w:footer="708" w:gutter="0"/>
+      <w:pgMar w:top="300" w:right="1440" w:bottom="720" w:left="1440" w:header="708" w:footer="708" w:gutter="0"/>
       <w:cols w:space="708"/>
       <w:docGrid w:linePitch="360"/>
     </w:sectPr>

</xml_diff>